<commit_message>
Restore the original guarantee wording in the CFA fragment
Keep the tax preference and partner payments as stated in the source text.
</commit_message>
<xml_diff>
--- a/docs/Soglashenie_investor_CFA.docx
+++ b/docs/Soglashenie_investor_CFA.docx
@@ -263,7 +263,7 @@
           <w:color w:val="141C24"/>
           <w:sz w:val="24"/>
         </w:rPr>
-        <w:t>Денежные требования по ЦФА обеспечены арендными и коммерческими потоками спортивно-образовательных кластеров, включая целевые поступления от вузов-партнёров за размещение студентов-квотников Академии Select Pro.</w:t>
+        <w:t xml:space="preserve"> Денежные требования по ЦФА обеспечены арендными и коммерческими потоками спортивно-образовательных кластеров, включая гарантированные целевые поступления от вузов-партнёров за размещение студентов-квотников Академии Select Pro.</w:t>
       </w:r>
     </w:p>
     <w:p>
@@ -331,7 +331,7 @@
           <w:color w:val="141C24"/>
           <w:sz w:val="24"/>
         </w:rPr>
-        <w:t>Эмитент ЦФА — ООО «Селект Про Девелопмент», резидент особой экономической зоны. При расчёте доходности применяется льготная ставка 0% на прибыль, в соответствии с законодательством об ОЭЗ.</w:t>
+        <w:t xml:space="preserve"> Эмитент ЦФА — ООО «Селект Про Девелопмент» — резидент особой экономической зоны. Статус резидента гарантирует льготную ставку 0% на прибыль, в соответствии с законодательством об ОЭЗ, при расчёте доходности активов.</w:t>
       </w:r>
     </w:p>
     <w:p>

</xml_diff>

<commit_message>
Draft the missing sections of the CFA investor agreement
Keep the original clauses and add investor status, risks, withdrawal, personal data, acceptance, liability and governing law as a draft.
</commit_message>
<xml_diff>
--- a/docs/Soglashenie_investor_CFA.docx
+++ b/docs/Soglashenie_investor_CFA.docx
@@ -140,7 +140,7 @@
     </w:p>
     <w:p>
       <w:pPr>
-        <w:spacing w:before="40" w:after="160" w:line="259" w:lineRule="auto"/>
+        <w:spacing w:before="80" w:after="40" w:line="259" w:lineRule="auto"/>
         <w:jc w:val="center"/>
       </w:pPr>
       <w:r>
@@ -149,11 +149,26 @@
           <w:b w:val="0"/>
           <w:i/>
           <w:color w:val="5C6874"/>
-          <w:sz w:val="22"/>
+          <w:sz w:val="20"/>
         </w:rPr>
-        <w:t>Фрагмент. Подписывается инвестором в личном кабинете</w:t>
-        <w:br/>
-        <w:t>в электронном виде перед покупкой долей.</w:t>
+        <w:t>Черновик. Разделы 1–3 — исходный фрагмент. Разделы 4–10 дописаны и до подписания должны быть проверены юристом по ЦФА.</w:t>
+      </w:r>
+    </w:p>
+    <w:p>
+      <w:pPr>
+        <w:spacing w:before="160" w:after="40" w:line="259" w:lineRule="auto"/>
+        <w:ind w:firstLine="567"/>
+        <w:jc w:val="both"/>
+      </w:pPr>
+      <w:r>
+        <w:rPr>
+          <w:rFonts w:ascii="Times New Roman" w:hAnsi="Times New Roman" w:eastAsia="Times New Roman"/>
+          <w:b w:val="0"/>
+          <w:i w:val="0"/>
+          <w:color w:val="141C24"/>
+          <w:sz w:val="24"/>
+        </w:rPr>
+        <w:t>АНО «Селект Про Спорт» и платформа Select Pro, далее — «Платформа», с одной стороны, и лицо, принявшее соглашение в личном кабинете, далее — «Инвестор», с другой стороны, заключили соглашение о нижеследующем.</w:t>
       </w:r>
     </w:p>
     <w:p>
@@ -196,6 +211,32 @@
           <w:sz w:val="24"/>
         </w:rPr>
         <w:t>Соглашение регулирует доступ Инвестора к инвестиционному контуру платформы Select Pro, покупку цифровых финансовых активов, выпущенных на информационной платформе партнёра (Альфа-Банк), и получение дохода от редевелопмента объектов культурного наследия и создания кластеров.</w:t>
+      </w:r>
+    </w:p>
+    <w:p>
+      <w:pPr>
+        <w:spacing w:before="60" w:after="40" w:line="276" w:lineRule="auto"/>
+        <w:jc w:val="both"/>
+      </w:pPr>
+      <w:r>
+        <w:rPr>
+          <w:rFonts w:ascii="Times New Roman" w:hAnsi="Times New Roman" w:eastAsia="Times New Roman"/>
+          <w:b/>
+          <w:i w:val="0"/>
+          <w:color w:val="141C24"/>
+          <w:sz w:val="24"/>
+        </w:rPr>
+        <w:t xml:space="preserve">1.2. </w:t>
+      </w:r>
+      <w:r>
+        <w:rPr>
+          <w:rFonts w:ascii="Times New Roman" w:hAnsi="Times New Roman" w:eastAsia="Times New Roman"/>
+          <w:b w:val="0"/>
+          <w:i w:val="0"/>
+          <w:color w:val="141C24"/>
+          <w:sz w:val="24"/>
+        </w:rPr>
+        <w:t>Условия конкретного выпуска — срок, цена, порядок выплат и круг лиц, которым выпуск доступен, — задаёт решение о выпуске ЦФА этого объекта. Если решение о выпуске и это соглашение расходятся, для купленного выпуска приоритет у решения о выпуске.</w:t>
       </w:r>
     </w:p>
     <w:p>
@@ -263,7 +304,7 @@
           <w:color w:val="141C24"/>
           <w:sz w:val="24"/>
         </w:rPr>
-        <w:t xml:space="preserve"> Денежные требования по ЦФА обеспечены арендными и коммерческими потоками спортивно-образовательных кластеров, включая гарантированные целевые поступления от вузов-партнёров за размещение студентов-квотников Академии Select Pro.</w:t>
+        <w:t>Денежные требования по ЦФА обеспечены арендными и коммерческими потоками спортивно-образовательных кластеров, включая гарантированные целевые поступления от вузов-партнёров за размещение студентов-квотников Академии Select Pro.</w:t>
       </w:r>
     </w:p>
     <w:p>
@@ -290,6 +331,32 @@
           <w:sz w:val="24"/>
         </w:rPr>
         <w:t>Доход по ЦФА распределяется и выплачивается автоматически, по алгоритмам смарт-контрактов информационной системы Альфа-Банка.</w:t>
+      </w:r>
+    </w:p>
+    <w:p>
+      <w:pPr>
+        <w:spacing w:before="60" w:after="40" w:line="276" w:lineRule="auto"/>
+        <w:jc w:val="both"/>
+      </w:pPr>
+      <w:r>
+        <w:rPr>
+          <w:rFonts w:ascii="Times New Roman" w:hAnsi="Times New Roman" w:eastAsia="Times New Roman"/>
+          <w:b/>
+          <w:i w:val="0"/>
+          <w:color w:val="141C24"/>
+          <w:sz w:val="24"/>
+        </w:rPr>
+        <w:t xml:space="preserve">2.4. </w:t>
+      </w:r>
+      <w:r>
+        <w:rPr>
+          <w:rFonts w:ascii="Times New Roman" w:hAnsi="Times New Roman" w:eastAsia="Times New Roman"/>
+          <w:b w:val="0"/>
+          <w:i w:val="0"/>
+          <w:color w:val="141C24"/>
+          <w:sz w:val="24"/>
+        </w:rPr>
+        <w:t>Платформа не принимает деньги Инвестора на свой счёт. Оплата и учёт ЦФА проходят у оператора информационной системы.</w:t>
       </w:r>
     </w:p>
     <w:p>
@@ -331,14 +398,24 @@
           <w:color w:val="141C24"/>
           <w:sz w:val="24"/>
         </w:rPr>
-        <w:t xml:space="preserve"> Эмитент ЦФА — ООО «Селект Про Девелопмент» — резидент особой экономической зоны. Статус резидента гарантирует льготную ставку 0% на прибыль, в соответствии с законодательством об ОЭЗ, при расчёте доходности активов.</w:t>
+        <w:t>Эмитент ЦФА — ООО «Селект Про Девелопмент» — резидент особой экономической зоны. Статус резидента гарантирует льготную ставку 0% на прибыль, в соответствии с законодательством об ОЭЗ, при расчёте доходности активов.</w:t>
       </w:r>
     </w:p>
     <w:p>
       <w:pPr>
-        <w:spacing w:before="280" w:after="40" w:line="259" w:lineRule="auto"/>
+        <w:spacing w:before="60" w:after="40" w:line="276" w:lineRule="auto"/>
         <w:jc w:val="both"/>
       </w:pPr>
+      <w:r>
+        <w:rPr>
+          <w:rFonts w:ascii="Times New Roman" w:hAnsi="Times New Roman" w:eastAsia="Times New Roman"/>
+          <w:b/>
+          <w:i w:val="0"/>
+          <w:color w:val="141C24"/>
+          <w:sz w:val="24"/>
+        </w:rPr>
+        <w:t xml:space="preserve">3.2. </w:t>
+      </w:r>
       <w:r>
         <w:rPr>
           <w:rFonts w:ascii="Times New Roman" w:hAnsi="Times New Roman" w:eastAsia="Times New Roman"/>
@@ -347,12 +424,722 @@
           <w:color w:val="141C24"/>
           <w:sz w:val="24"/>
         </w:rPr>
-        <w:t>Инвестор подтверждает, что ознакомился с этим фрагментом соглашения и принимает его перед покупкой долей.</w:t>
+        <w:t>Льгота относится к налогу эмитента. Она не отменяет налог Инвестора с полученного дохода. Инвестор считает и платит свой налог сам, если закон не переносит эту обязанность на оператора или налогового агента.</w:t>
       </w:r>
     </w:p>
     <w:p>
       <w:pPr>
-        <w:spacing w:before="240" w:after="40" w:line="259" w:lineRule="auto"/>
+        <w:spacing w:before="240" w:after="80" w:line="259" w:lineRule="auto"/>
+        <w:jc w:val="center"/>
+      </w:pPr>
+      <w:r>
+        <w:rPr>
+          <w:rFonts w:ascii="Times New Roman" w:hAnsi="Times New Roman" w:eastAsia="Times New Roman"/>
+          <w:b/>
+          <w:i w:val="0"/>
+          <w:color w:val="141C24"/>
+          <w:sz w:val="24"/>
+        </w:rPr>
+        <w:t>4. Кто может принять соглашение</w:t>
+      </w:r>
+    </w:p>
+    <w:p>
+      <w:pPr>
+        <w:spacing w:before="60" w:after="40" w:line="276" w:lineRule="auto"/>
+        <w:jc w:val="both"/>
+      </w:pPr>
+      <w:r>
+        <w:rPr>
+          <w:rFonts w:ascii="Times New Roman" w:hAnsi="Times New Roman" w:eastAsia="Times New Roman"/>
+          <w:b/>
+          <w:i w:val="0"/>
+          <w:color w:val="141C24"/>
+          <w:sz w:val="24"/>
+        </w:rPr>
+        <w:t xml:space="preserve">4.1. </w:t>
+      </w:r>
+      <w:r>
+        <w:rPr>
+          <w:rFonts w:ascii="Times New Roman" w:hAnsi="Times New Roman" w:eastAsia="Times New Roman"/>
+          <w:b w:val="0"/>
+          <w:i w:val="0"/>
+          <w:color w:val="141C24"/>
+          <w:sz w:val="24"/>
+        </w:rPr>
+        <w:t>Соглашение принимает дееспособное лицо, у которого есть личный кабинет на Платформе. Инвестор указывает о себе верные сведения и обновляет их, если они изменились.</w:t>
+      </w:r>
+    </w:p>
+    <w:p>
+      <w:pPr>
+        <w:spacing w:before="60" w:after="40" w:line="276" w:lineRule="auto"/>
+        <w:jc w:val="both"/>
+      </w:pPr>
+      <w:r>
+        <w:rPr>
+          <w:rFonts w:ascii="Times New Roman" w:hAnsi="Times New Roman" w:eastAsia="Times New Roman"/>
+          <w:b/>
+          <w:i w:val="0"/>
+          <w:color w:val="141C24"/>
+          <w:sz w:val="24"/>
+        </w:rPr>
+        <w:t xml:space="preserve">4.2. </w:t>
+      </w:r>
+      <w:r>
+        <w:rPr>
+          <w:rFonts w:ascii="Times New Roman" w:hAnsi="Times New Roman" w:eastAsia="Times New Roman"/>
+          <w:b w:val="0"/>
+          <w:i w:val="0"/>
+          <w:color w:val="141C24"/>
+          <w:sz w:val="24"/>
+        </w:rPr>
+        <w:t>Инвестор покупает выпуск только если решение о выпуске допускает его статус: квалифицированного инвестора или неквалифицированного, в пределах лимита, который установлен для такого лица.</w:t>
+      </w:r>
+    </w:p>
+    <w:p>
+      <w:pPr>
+        <w:spacing w:before="60" w:after="40" w:line="276" w:lineRule="auto"/>
+        <w:jc w:val="both"/>
+      </w:pPr>
+      <w:r>
+        <w:rPr>
+          <w:rFonts w:ascii="Times New Roman" w:hAnsi="Times New Roman" w:eastAsia="Times New Roman"/>
+          <w:b/>
+          <w:i w:val="0"/>
+          <w:color w:val="141C24"/>
+          <w:sz w:val="24"/>
+        </w:rPr>
+        <w:t xml:space="preserve">4.3. </w:t>
+      </w:r>
+      <w:r>
+        <w:rPr>
+          <w:rFonts w:ascii="Times New Roman" w:hAnsi="Times New Roman" w:eastAsia="Times New Roman"/>
+          <w:b w:val="0"/>
+          <w:i w:val="0"/>
+          <w:color w:val="141C24"/>
+          <w:sz w:val="24"/>
+        </w:rPr>
+        <w:t>Принятие соглашения не обязывает Инвестора купить ЦФА. Обязанность оплатить выпуск возникает только в момент заявки на покупку.</w:t>
+      </w:r>
+    </w:p>
+    <w:p>
+      <w:pPr>
+        <w:spacing w:before="240" w:after="80" w:line="259" w:lineRule="auto"/>
+        <w:jc w:val="center"/>
+      </w:pPr>
+      <w:r>
+        <w:rPr>
+          <w:rFonts w:ascii="Times New Roman" w:hAnsi="Times New Roman" w:eastAsia="Times New Roman"/>
+          <w:b/>
+          <w:i w:val="0"/>
+          <w:color w:val="141C24"/>
+          <w:sz w:val="24"/>
+        </w:rPr>
+        <w:t>5. Риски</w:t>
+      </w:r>
+    </w:p>
+    <w:p>
+      <w:pPr>
+        <w:spacing w:before="60" w:after="40" w:line="276" w:lineRule="auto"/>
+        <w:jc w:val="both"/>
+      </w:pPr>
+      <w:r>
+        <w:rPr>
+          <w:rFonts w:ascii="Times New Roman" w:hAnsi="Times New Roman" w:eastAsia="Times New Roman"/>
+          <w:b/>
+          <w:i w:val="0"/>
+          <w:color w:val="141C24"/>
+          <w:sz w:val="24"/>
+        </w:rPr>
+        <w:t xml:space="preserve">5.1. </w:t>
+      </w:r>
+      <w:r>
+        <w:rPr>
+          <w:rFonts w:ascii="Times New Roman" w:hAnsi="Times New Roman" w:eastAsia="Times New Roman"/>
+          <w:b w:val="0"/>
+          <w:i w:val="0"/>
+          <w:color w:val="141C24"/>
+          <w:sz w:val="24"/>
+        </w:rPr>
+        <w:t>ЦФА не являются банковским вкладом и не застрахованы системой страхования вкладов. Инвестор может потерять часть или всю вложенную сумму.</w:t>
+      </w:r>
+    </w:p>
+    <w:p>
+      <w:pPr>
+        <w:spacing w:before="60" w:after="40" w:line="276" w:lineRule="auto"/>
+        <w:jc w:val="both"/>
+      </w:pPr>
+      <w:r>
+        <w:rPr>
+          <w:rFonts w:ascii="Times New Roman" w:hAnsi="Times New Roman" w:eastAsia="Times New Roman"/>
+          <w:b/>
+          <w:i w:val="0"/>
+          <w:color w:val="141C24"/>
+          <w:sz w:val="24"/>
+        </w:rPr>
+        <w:t xml:space="preserve">5.2. </w:t>
+      </w:r>
+      <w:r>
+        <w:rPr>
+          <w:rFonts w:ascii="Times New Roman" w:hAnsi="Times New Roman" w:eastAsia="Times New Roman"/>
+          <w:b w:val="0"/>
+          <w:i w:val="0"/>
+          <w:color w:val="141C24"/>
+          <w:sz w:val="24"/>
+        </w:rPr>
+        <w:t>Поступления от аренды, вузов-партнёров и эксплуатации кластера зависят от заполняемости, сроков стройки и договоров. Их описание в пункте 2.2 не является обещанием фиксированной выплаты Инвестору сверх того, что прямо написано в решении о выпуске.</w:t>
+      </w:r>
+    </w:p>
+    <w:p>
+      <w:pPr>
+        <w:spacing w:before="60" w:after="40" w:line="276" w:lineRule="auto"/>
+        <w:jc w:val="both"/>
+      </w:pPr>
+      <w:r>
+        <w:rPr>
+          <w:rFonts w:ascii="Times New Roman" w:hAnsi="Times New Roman" w:eastAsia="Times New Roman"/>
+          <w:b/>
+          <w:i w:val="0"/>
+          <w:color w:val="141C24"/>
+          <w:sz w:val="24"/>
+        </w:rPr>
+        <w:t xml:space="preserve">5.3. </w:t>
+      </w:r>
+      <w:r>
+        <w:rPr>
+          <w:rFonts w:ascii="Times New Roman" w:hAnsi="Times New Roman" w:eastAsia="Times New Roman"/>
+          <w:b w:val="0"/>
+          <w:i w:val="0"/>
+          <w:color w:val="141C24"/>
+          <w:sz w:val="24"/>
+        </w:rPr>
+        <w:t>Статус резидента ОЭЗ и ставка 0% для эмитента могут измениться, если изменятся закон или статус компании. Это влияет на расчёт доходности, но не создаёт отдельного долга Платформы перед Инвестором.</w:t>
+      </w:r>
+    </w:p>
+    <w:p>
+      <w:pPr>
+        <w:spacing w:before="60" w:after="40" w:line="276" w:lineRule="auto"/>
+        <w:jc w:val="both"/>
+      </w:pPr>
+      <w:r>
+        <w:rPr>
+          <w:rFonts w:ascii="Times New Roman" w:hAnsi="Times New Roman" w:eastAsia="Times New Roman"/>
+          <w:b/>
+          <w:i w:val="0"/>
+          <w:color w:val="141C24"/>
+          <w:sz w:val="24"/>
+        </w:rPr>
+        <w:t xml:space="preserve">5.4. </w:t>
+      </w:r>
+      <w:r>
+        <w:rPr>
+          <w:rFonts w:ascii="Times New Roman" w:hAnsi="Times New Roman" w:eastAsia="Times New Roman"/>
+          <w:b w:val="0"/>
+          <w:i w:val="0"/>
+          <w:color w:val="141C24"/>
+          <w:sz w:val="24"/>
+        </w:rPr>
+        <w:t>Инвестор принимает технический риск: сбой информационной системы, смарт-контракта или шлюза Альфа-Банка может задержать покупку или выплату. Продать ЦФА до срока можно только способом, который разрешает решение о выпуске. Такого способа может не быть.</w:t>
+      </w:r>
+    </w:p>
+    <w:p>
+      <w:pPr>
+        <w:spacing w:before="60" w:after="40" w:line="276" w:lineRule="auto"/>
+        <w:jc w:val="both"/>
+      </w:pPr>
+      <w:r>
+        <w:rPr>
+          <w:rFonts w:ascii="Times New Roman" w:hAnsi="Times New Roman" w:eastAsia="Times New Roman"/>
+          <w:b/>
+          <w:i w:val="0"/>
+          <w:color w:val="141C24"/>
+          <w:sz w:val="24"/>
+        </w:rPr>
+        <w:t xml:space="preserve">5.5. </w:t>
+      </w:r>
+      <w:r>
+        <w:rPr>
+          <w:rFonts w:ascii="Times New Roman" w:hAnsi="Times New Roman" w:eastAsia="Times New Roman"/>
+          <w:b w:val="0"/>
+          <w:i w:val="0"/>
+          <w:color w:val="141C24"/>
+          <w:sz w:val="24"/>
+        </w:rPr>
+        <w:t>Редевелопмент объекта культурного наследия может сдвинуться по срокам из-за согласований, работ и ограничений по самому объекту.</w:t>
+      </w:r>
+    </w:p>
+    <w:p>
+      <w:pPr>
+        <w:spacing w:before="240" w:after="80" w:line="259" w:lineRule="auto"/>
+        <w:jc w:val="center"/>
+      </w:pPr>
+      <w:r>
+        <w:rPr>
+          <w:rFonts w:ascii="Times New Roman" w:hAnsi="Times New Roman" w:eastAsia="Times New Roman"/>
+          <w:b/>
+          <w:i w:val="0"/>
+          <w:color w:val="141C24"/>
+          <w:sz w:val="24"/>
+        </w:rPr>
+        <w:t>6. Отказ от покупки</w:t>
+      </w:r>
+    </w:p>
+    <w:p>
+      <w:pPr>
+        <w:spacing w:before="60" w:after="40" w:line="276" w:lineRule="auto"/>
+        <w:jc w:val="both"/>
+      </w:pPr>
+      <w:r>
+        <w:rPr>
+          <w:rFonts w:ascii="Times New Roman" w:hAnsi="Times New Roman" w:eastAsia="Times New Roman"/>
+          <w:b/>
+          <w:i w:val="0"/>
+          <w:color w:val="141C24"/>
+          <w:sz w:val="24"/>
+        </w:rPr>
+        <w:t xml:space="preserve">6.1. </w:t>
+      </w:r>
+      <w:r>
+        <w:rPr>
+          <w:rFonts w:ascii="Times New Roman" w:hAnsi="Times New Roman" w:eastAsia="Times New Roman"/>
+          <w:b w:val="0"/>
+          <w:i w:val="0"/>
+          <w:color w:val="141C24"/>
+          <w:sz w:val="24"/>
+        </w:rPr>
+        <w:t>До того как оператор принял заявку к исполнению, Инвестор отзывает её в личном кабинете. Деньги, которые оператор ещё не списал, не списываются.</w:t>
+      </w:r>
+    </w:p>
+    <w:p>
+      <w:pPr>
+        <w:spacing w:before="60" w:after="40" w:line="276" w:lineRule="auto"/>
+        <w:jc w:val="both"/>
+      </w:pPr>
+      <w:r>
+        <w:rPr>
+          <w:rFonts w:ascii="Times New Roman" w:hAnsi="Times New Roman" w:eastAsia="Times New Roman"/>
+          <w:b/>
+          <w:i w:val="0"/>
+          <w:color w:val="141C24"/>
+          <w:sz w:val="24"/>
+        </w:rPr>
+        <w:t xml:space="preserve">6.2. </w:t>
+      </w:r>
+      <w:r>
+        <w:rPr>
+          <w:rFonts w:ascii="Times New Roman" w:hAnsi="Times New Roman" w:eastAsia="Times New Roman"/>
+          <w:b w:val="0"/>
+          <w:i w:val="0"/>
+          <w:color w:val="141C24"/>
+          <w:sz w:val="24"/>
+        </w:rPr>
+        <w:t>После исполнения заявки отказ от уже купленных ЦФА идёт только по решению о выпуске: погашение, выкуп или обращение. Одной кнопкой в кабинете покупку отменить нельзя, если решение о выпуске этого не предусматривает.</w:t>
+      </w:r>
+    </w:p>
+    <w:p>
+      <w:pPr>
+        <w:spacing w:before="60" w:after="40" w:line="276" w:lineRule="auto"/>
+        <w:jc w:val="both"/>
+      </w:pPr>
+      <w:r>
+        <w:rPr>
+          <w:rFonts w:ascii="Times New Roman" w:hAnsi="Times New Roman" w:eastAsia="Times New Roman"/>
+          <w:b/>
+          <w:i w:val="0"/>
+          <w:color w:val="141C24"/>
+          <w:sz w:val="24"/>
+        </w:rPr>
+        <w:t xml:space="preserve">6.3. </w:t>
+      </w:r>
+      <w:r>
+        <w:rPr>
+          <w:rFonts w:ascii="Times New Roman" w:hAnsi="Times New Roman" w:eastAsia="Times New Roman"/>
+          <w:b w:val="0"/>
+          <w:i w:val="0"/>
+          <w:color w:val="141C24"/>
+          <w:sz w:val="24"/>
+        </w:rPr>
+        <w:t>Платформа закрывает доступ к новым покупкам, если Инвестор сам закрыл кабинет, сообщил о недостоверных сведениях или закон запрещает ему этот выпуск.</w:t>
+      </w:r>
+    </w:p>
+    <w:p>
+      <w:pPr>
+        <w:spacing w:before="240" w:after="80" w:line="259" w:lineRule="auto"/>
+        <w:jc w:val="center"/>
+      </w:pPr>
+      <w:r>
+        <w:rPr>
+          <w:rFonts w:ascii="Times New Roman" w:hAnsi="Times New Roman" w:eastAsia="Times New Roman"/>
+          <w:b/>
+          <w:i w:val="0"/>
+          <w:color w:val="141C24"/>
+          <w:sz w:val="24"/>
+        </w:rPr>
+        <w:t>7. Персональные данные</w:t>
+      </w:r>
+    </w:p>
+    <w:p>
+      <w:pPr>
+        <w:spacing w:before="60" w:after="40" w:line="276" w:lineRule="auto"/>
+        <w:jc w:val="both"/>
+      </w:pPr>
+      <w:r>
+        <w:rPr>
+          <w:rFonts w:ascii="Times New Roman" w:hAnsi="Times New Roman" w:eastAsia="Times New Roman"/>
+          <w:b/>
+          <w:i w:val="0"/>
+          <w:color w:val="141C24"/>
+          <w:sz w:val="24"/>
+        </w:rPr>
+        <w:t xml:space="preserve">7.1. </w:t>
+      </w:r>
+      <w:r>
+        <w:rPr>
+          <w:rFonts w:ascii="Times New Roman" w:hAnsi="Times New Roman" w:eastAsia="Times New Roman"/>
+          <w:b w:val="0"/>
+          <w:i w:val="0"/>
+          <w:color w:val="141C24"/>
+          <w:sz w:val="24"/>
+        </w:rPr>
+        <w:t>Инвестор разрешает Платформе обрабатывать его имя, контакты, паспортные и платёжные сведения, статус инвестора и историю заявок. Цель — доступ в кабинет, передача заявки оператору ЦФА и исполнение этого соглашения.</w:t>
+      </w:r>
+    </w:p>
+    <w:p>
+      <w:pPr>
+        <w:spacing w:before="60" w:after="40" w:line="276" w:lineRule="auto"/>
+        <w:jc w:val="both"/>
+      </w:pPr>
+      <w:r>
+        <w:rPr>
+          <w:rFonts w:ascii="Times New Roman" w:hAnsi="Times New Roman" w:eastAsia="Times New Roman"/>
+          <w:b/>
+          <w:i w:val="0"/>
+          <w:color w:val="141C24"/>
+          <w:sz w:val="24"/>
+        </w:rPr>
+        <w:t xml:space="preserve">7.2. </w:t>
+      </w:r>
+      <w:r>
+        <w:rPr>
+          <w:rFonts w:ascii="Times New Roman" w:hAnsi="Times New Roman" w:eastAsia="Times New Roman"/>
+          <w:b w:val="0"/>
+          <w:i w:val="0"/>
+          <w:color w:val="141C24"/>
+          <w:sz w:val="24"/>
+        </w:rPr>
+        <w:t>Для покупки и выплаты Платформа передаёт эти сведения Альфа-Банку как оператору информационной системы и эмитенту — в объёме, без которого выпуск не провести. Срок хранения — пока открыт кабинет и ещё столько, сколько требует закон о ЦФА, бухгалтерии и противодействии отмыванию денег.</w:t>
+      </w:r>
+    </w:p>
+    <w:p>
+      <w:pPr>
+        <w:spacing w:before="60" w:after="40" w:line="276" w:lineRule="auto"/>
+        <w:jc w:val="both"/>
+      </w:pPr>
+      <w:r>
+        <w:rPr>
+          <w:rFonts w:ascii="Times New Roman" w:hAnsi="Times New Roman" w:eastAsia="Times New Roman"/>
+          <w:b/>
+          <w:i w:val="0"/>
+          <w:color w:val="141C24"/>
+          <w:sz w:val="24"/>
+        </w:rPr>
+        <w:t xml:space="preserve">7.3. </w:t>
+      </w:r>
+      <w:r>
+        <w:rPr>
+          <w:rFonts w:ascii="Times New Roman" w:hAnsi="Times New Roman" w:eastAsia="Times New Roman"/>
+          <w:b w:val="0"/>
+          <w:i w:val="0"/>
+          <w:color w:val="141C24"/>
+          <w:sz w:val="24"/>
+        </w:rPr>
+        <w:t>Инвестор может отозвать согласие на обработку, написав на info@interselectpro.ru. Отзыв не отменяет уже исполненную покупку и не прекращает обработку, которую оператор и эмитент ведут по закону.</w:t>
+      </w:r>
+    </w:p>
+    <w:p>
+      <w:pPr>
+        <w:spacing w:before="240" w:after="80" w:line="259" w:lineRule="auto"/>
+        <w:jc w:val="center"/>
+      </w:pPr>
+      <w:r>
+        <w:rPr>
+          <w:rFonts w:ascii="Times New Roman" w:hAnsi="Times New Roman" w:eastAsia="Times New Roman"/>
+          <w:b/>
+          <w:i w:val="0"/>
+          <w:color w:val="141C24"/>
+          <w:sz w:val="24"/>
+        </w:rPr>
+        <w:t>8. Как соглашение подписывается</w:t>
+      </w:r>
+    </w:p>
+    <w:p>
+      <w:pPr>
+        <w:spacing w:before="60" w:after="40" w:line="276" w:lineRule="auto"/>
+        <w:jc w:val="both"/>
+      </w:pPr>
+      <w:r>
+        <w:rPr>
+          <w:rFonts w:ascii="Times New Roman" w:hAnsi="Times New Roman" w:eastAsia="Times New Roman"/>
+          <w:b/>
+          <w:i w:val="0"/>
+          <w:color w:val="141C24"/>
+          <w:sz w:val="24"/>
+        </w:rPr>
+        <w:t xml:space="preserve">8.1. </w:t>
+      </w:r>
+      <w:r>
+        <w:rPr>
+          <w:rFonts w:ascii="Times New Roman" w:hAnsi="Times New Roman" w:eastAsia="Times New Roman"/>
+          <w:b w:val="0"/>
+          <w:i w:val="0"/>
+          <w:color w:val="141C24"/>
+          <w:sz w:val="24"/>
+        </w:rPr>
+        <w:t>Соглашение заключается в электронном виде. Нажатие подтверждения в личном кабинете перед покупкой долей означает, что Инвестор прочитал текст и принял его. Отдельная бумага не подписывается.</w:t>
+      </w:r>
+    </w:p>
+    <w:p>
+      <w:pPr>
+        <w:spacing w:before="60" w:after="40" w:line="276" w:lineRule="auto"/>
+        <w:jc w:val="both"/>
+      </w:pPr>
+      <w:r>
+        <w:rPr>
+          <w:rFonts w:ascii="Times New Roman" w:hAnsi="Times New Roman" w:eastAsia="Times New Roman"/>
+          <w:b/>
+          <w:i w:val="0"/>
+          <w:color w:val="141C24"/>
+          <w:sz w:val="24"/>
+        </w:rPr>
+        <w:t xml:space="preserve">8.2. </w:t>
+      </w:r>
+      <w:r>
+        <w:rPr>
+          <w:rFonts w:ascii="Times New Roman" w:hAnsi="Times New Roman" w:eastAsia="Times New Roman"/>
+          <w:b w:val="0"/>
+          <w:i w:val="0"/>
+          <w:color w:val="141C24"/>
+          <w:sz w:val="24"/>
+        </w:rPr>
+        <w:t>Логин, пароль и код подтверждения Инвестор хранит сам. Действия в его кабинете считаются его действиями, пока он не сообщил Платформе, что доступ потерян.</w:t>
+      </w:r>
+    </w:p>
+    <w:p>
+      <w:pPr>
+        <w:spacing w:before="240" w:after="80" w:line="259" w:lineRule="auto"/>
+        <w:jc w:val="center"/>
+      </w:pPr>
+      <w:r>
+        <w:rPr>
+          <w:rFonts w:ascii="Times New Roman" w:hAnsi="Times New Roman" w:eastAsia="Times New Roman"/>
+          <w:b/>
+          <w:i w:val="0"/>
+          <w:color w:val="141C24"/>
+          <w:sz w:val="24"/>
+        </w:rPr>
+        <w:t>9. Ответственность</w:t>
+      </w:r>
+    </w:p>
+    <w:p>
+      <w:pPr>
+        <w:spacing w:before="60" w:after="40" w:line="276" w:lineRule="auto"/>
+        <w:jc w:val="both"/>
+      </w:pPr>
+      <w:r>
+        <w:rPr>
+          <w:rFonts w:ascii="Times New Roman" w:hAnsi="Times New Roman" w:eastAsia="Times New Roman"/>
+          <w:b/>
+          <w:i w:val="0"/>
+          <w:color w:val="141C24"/>
+          <w:sz w:val="24"/>
+        </w:rPr>
+        <w:t xml:space="preserve">9.1. </w:t>
+      </w:r>
+      <w:r>
+        <w:rPr>
+          <w:rFonts w:ascii="Times New Roman" w:hAnsi="Times New Roman" w:eastAsia="Times New Roman"/>
+          <w:b w:val="0"/>
+          <w:i w:val="0"/>
+          <w:color w:val="141C24"/>
+          <w:sz w:val="24"/>
+        </w:rPr>
+        <w:t>Эмитент ЦФА — ООО «Селект Про Девелопмент». Оператор информационной системы — Альфа-Банк. Платформа даёт доступ к контуру и передаёт заявку. Она не выпускает ЦФА и не проводит расчёты вместо оператора.</w:t>
+      </w:r>
+    </w:p>
+    <w:p>
+      <w:pPr>
+        <w:spacing w:before="60" w:after="40" w:line="276" w:lineRule="auto"/>
+        <w:jc w:val="both"/>
+      </w:pPr>
+      <w:r>
+        <w:rPr>
+          <w:rFonts w:ascii="Times New Roman" w:hAnsi="Times New Roman" w:eastAsia="Times New Roman"/>
+          <w:b/>
+          <w:i w:val="0"/>
+          <w:color w:val="141C24"/>
+          <w:sz w:val="24"/>
+        </w:rPr>
+        <w:t xml:space="preserve">9.2. </w:t>
+      </w:r>
+      <w:r>
+        <w:rPr>
+          <w:rFonts w:ascii="Times New Roman" w:hAnsi="Times New Roman" w:eastAsia="Times New Roman"/>
+          <w:b w:val="0"/>
+          <w:i w:val="0"/>
+          <w:color w:val="141C24"/>
+          <w:sz w:val="24"/>
+        </w:rPr>
+        <w:t>Платформа не отвечает за содержание решения о выпуске, за расчёт смарт-контракта и за налоговую льготу эмитента. За умысел и грубую неосторожность Платформы ответственность сохраняется.</w:t>
+      </w:r>
+    </w:p>
+    <w:p>
+      <w:pPr>
+        <w:spacing w:before="60" w:after="40" w:line="276" w:lineRule="auto"/>
+        <w:jc w:val="both"/>
+      </w:pPr>
+      <w:r>
+        <w:rPr>
+          <w:rFonts w:ascii="Times New Roman" w:hAnsi="Times New Roman" w:eastAsia="Times New Roman"/>
+          <w:b/>
+          <w:i w:val="0"/>
+          <w:color w:val="141C24"/>
+          <w:sz w:val="24"/>
+        </w:rPr>
+        <w:t xml:space="preserve">9.3. </w:t>
+      </w:r>
+      <w:r>
+        <w:rPr>
+          <w:rFonts w:ascii="Times New Roman" w:hAnsi="Times New Roman" w:eastAsia="Times New Roman"/>
+          <w:b w:val="0"/>
+          <w:i w:val="0"/>
+          <w:color w:val="141C24"/>
+          <w:sz w:val="24"/>
+        </w:rPr>
+        <w:t>Инвестор возмещает потери Платформы, если купил выпуск по ложным сведениям о себе или передал доступ к кабинету третьему лицу.</w:t>
+      </w:r>
+    </w:p>
+    <w:p>
+      <w:pPr>
+        <w:spacing w:before="240" w:after="80" w:line="259" w:lineRule="auto"/>
+        <w:jc w:val="center"/>
+      </w:pPr>
+      <w:r>
+        <w:rPr>
+          <w:rFonts w:ascii="Times New Roman" w:hAnsi="Times New Roman" w:eastAsia="Times New Roman"/>
+          <w:b/>
+          <w:i w:val="0"/>
+          <w:color w:val="141C24"/>
+          <w:sz w:val="24"/>
+        </w:rPr>
+        <w:t>10. Срок, изменения и право</w:t>
+      </w:r>
+    </w:p>
+    <w:p>
+      <w:pPr>
+        <w:spacing w:before="60" w:after="40" w:line="276" w:lineRule="auto"/>
+        <w:jc w:val="both"/>
+      </w:pPr>
+      <w:r>
+        <w:rPr>
+          <w:rFonts w:ascii="Times New Roman" w:hAnsi="Times New Roman" w:eastAsia="Times New Roman"/>
+          <w:b/>
+          <w:i w:val="0"/>
+          <w:color w:val="141C24"/>
+          <w:sz w:val="24"/>
+        </w:rPr>
+        <w:t xml:space="preserve">10.1. </w:t>
+      </w:r>
+      <w:r>
+        <w:rPr>
+          <w:rFonts w:ascii="Times New Roman" w:hAnsi="Times New Roman" w:eastAsia="Times New Roman"/>
+          <w:b w:val="0"/>
+          <w:i w:val="0"/>
+          <w:color w:val="141C24"/>
+          <w:sz w:val="24"/>
+        </w:rPr>
+        <w:t>Соглашение действует с момента принятия в кабинете и пока кабинет открыт. Права по уже купленным ЦФА после закрытия кабинета не исчезают: их определяет решение о выпуске.</w:t>
+      </w:r>
+    </w:p>
+    <w:p>
+      <w:pPr>
+        <w:spacing w:before="60" w:after="40" w:line="276" w:lineRule="auto"/>
+        <w:jc w:val="both"/>
+      </w:pPr>
+      <w:r>
+        <w:rPr>
+          <w:rFonts w:ascii="Times New Roman" w:hAnsi="Times New Roman" w:eastAsia="Times New Roman"/>
+          <w:b/>
+          <w:i w:val="0"/>
+          <w:color w:val="141C24"/>
+          <w:sz w:val="24"/>
+        </w:rPr>
+        <w:t xml:space="preserve">10.2. </w:t>
+      </w:r>
+      <w:r>
+        <w:rPr>
+          <w:rFonts w:ascii="Times New Roman" w:hAnsi="Times New Roman" w:eastAsia="Times New Roman"/>
+          <w:b w:val="0"/>
+          <w:i w:val="0"/>
+          <w:color w:val="141C24"/>
+          <w:sz w:val="24"/>
+        </w:rPr>
+        <w:t>Платформа публикует новую редакцию в кабинете не позднее чем за 10 дней до того, как она начнёт применяться к новым покупкам. Уже купленный выпуск эта редакция не меняет.</w:t>
+      </w:r>
+    </w:p>
+    <w:p>
+      <w:pPr>
+        <w:spacing w:before="60" w:after="40" w:line="276" w:lineRule="auto"/>
+        <w:jc w:val="both"/>
+      </w:pPr>
+      <w:r>
+        <w:rPr>
+          <w:rFonts w:ascii="Times New Roman" w:hAnsi="Times New Roman" w:eastAsia="Times New Roman"/>
+          <w:b/>
+          <w:i w:val="0"/>
+          <w:color w:val="141C24"/>
+          <w:sz w:val="24"/>
+        </w:rPr>
+        <w:t xml:space="preserve">10.3. </w:t>
+      </w:r>
+      <w:r>
+        <w:rPr>
+          <w:rFonts w:ascii="Times New Roman" w:hAnsi="Times New Roman" w:eastAsia="Times New Roman"/>
+          <w:b w:val="0"/>
+          <w:i w:val="0"/>
+          <w:color w:val="141C24"/>
+          <w:sz w:val="24"/>
+        </w:rPr>
+        <w:t>К соглашению применяется право Российской Федерации. Спор сначала направляется письмом на info@interselectpro.ru. Если за 30 дней он не урегулирован, его рассматривает суд по месту нахождения ответчика.</w:t>
+      </w:r>
+    </w:p>
+    <w:p>
+      <w:pPr>
+        <w:spacing w:before="60" w:after="40" w:line="276" w:lineRule="auto"/>
+        <w:jc w:val="both"/>
+      </w:pPr>
+      <w:r>
+        <w:rPr>
+          <w:rFonts w:ascii="Times New Roman" w:hAnsi="Times New Roman" w:eastAsia="Times New Roman"/>
+          <w:b/>
+          <w:i w:val="0"/>
+          <w:color w:val="141C24"/>
+          <w:sz w:val="24"/>
+        </w:rPr>
+        <w:t xml:space="preserve">10.4. </w:t>
+      </w:r>
+      <w:r>
+        <w:rPr>
+          <w:rFonts w:ascii="Times New Roman" w:hAnsi="Times New Roman" w:eastAsia="Times New Roman"/>
+          <w:b w:val="0"/>
+          <w:i w:val="0"/>
+          <w:color w:val="141C24"/>
+          <w:sz w:val="24"/>
+        </w:rPr>
+        <w:t>Если какой-то пункт признают недействительным, остальные продолжают действовать.</w:t>
+      </w:r>
+    </w:p>
+    <w:p>
+      <w:pPr>
+        <w:spacing w:before="280" w:after="40" w:line="259" w:lineRule="auto"/>
         <w:jc w:val="left"/>
       </w:pPr>
       <w:r>
@@ -400,23 +1187,7 @@
     </w:p>
     <w:p>
       <w:pPr>
-        <w:spacing w:before="320" w:after="40" w:line="259" w:lineRule="auto"/>
-        <w:jc w:val="both"/>
-      </w:pPr>
-      <w:r>
-        <w:rPr>
-          <w:rFonts w:ascii="Times New Roman" w:hAnsi="Times New Roman" w:eastAsia="Times New Roman"/>
-          <w:b w:val="0"/>
-          <w:i/>
-          <w:color w:val="5C6874"/>
-          <w:sz w:val="20"/>
-        </w:rPr>
-        <w:t>Дальше фрагмент обрывается: нет разделов об отказе от покупки, рисках, персональных данных и применимом праве. Их нужно дописать отдельно, в шаблон они не добавлены.</w:t>
-      </w:r>
-    </w:p>
-    <w:p>
-      <w:pPr>
-        <w:spacing w:before="240" w:after="0" w:line="259" w:lineRule="auto"/>
+        <w:spacing w:before="280" w:after="0" w:line="259" w:lineRule="auto"/>
         <w:jc w:val="center"/>
       </w:pPr>
       <w:r>

</xml_diff>